<commit_message>
Added more figures for secondary analysis
</commit_message>
<xml_diff>
--- a/project/project_background/Cancer Bioinformatics Project.docx
+++ b/project/project_background/Cancer Bioinformatics Project.docx
@@ -1353,6 +1353,7 @@
       <w:r>
         <w:rPr>
           <w:rFonts w:asciiTheme="minorHAnsi" w:hAnsiTheme="minorHAnsi"/>
+          <w:noProof/>
           <w:rtl/>
           <w:lang w:val="en-US"/>
         </w:rPr>
@@ -1595,6 +1596,7 @@
       <w:r>
         <w:rPr>
           <w:rFonts w:asciiTheme="minorHAnsi" w:hAnsiTheme="minorHAnsi"/>
+          <w:noProof/>
           <w:rtl/>
           <w:lang w:val="en-US"/>
         </w:rPr>
@@ -1691,12 +1693,1112 @@
       <w:pPr>
         <w:pStyle w:val="NormalWeb"/>
         <w:bidi/>
-        <w:rPr>
-          <w:rFonts w:asciiTheme="minorHAnsi" w:hAnsiTheme="minorHAnsi" w:hint="cs"/>
-          <w:rtl/>
-          <w:lang w:val="en-US"/>
-        </w:rPr>
-      </w:pPr>
+        <w:ind w:left="720"/>
+        <w:rPr>
+          <w:rFonts w:asciiTheme="minorHAnsi" w:hAnsiTheme="minorHAnsi"/>
+          <w:lang w:val="en-US"/>
+        </w:rPr>
+      </w:pPr>
+      <w:r>
+        <w:rPr>
+          <w:rFonts w:asciiTheme="minorHAnsi" w:hAnsiTheme="minorHAnsi" w:hint="cs"/>
+          <w:rtl/>
+          <w:lang w:val="en-US"/>
+        </w:rPr>
+        <w:t>מוטציות ב-</w:t>
+      </w:r>
+      <w:r>
+        <w:rPr>
+          <w:rFonts w:asciiTheme="minorHAnsi" w:hAnsiTheme="minorHAnsi"/>
+          <w:lang w:val="en-US"/>
+        </w:rPr>
+        <w:t>TP53</w:t>
+      </w:r>
+      <w:r>
+        <w:rPr>
+          <w:rFonts w:asciiTheme="minorHAnsi" w:hAnsiTheme="minorHAnsi" w:hint="cs"/>
+          <w:rtl/>
+          <w:lang w:val="en-US"/>
+        </w:rPr>
+        <w:t xml:space="preserve"> מעלות </w:t>
+      </w:r>
+      <w:r>
+        <w:rPr>
+          <w:rFonts w:asciiTheme="minorHAnsi" w:hAnsiTheme="minorHAnsi"/>
+          <w:lang w:val="en-US"/>
+        </w:rPr>
+        <w:t>FGA</w:t>
+      </w:r>
+      <w:r>
+        <w:rPr>
+          <w:rFonts w:asciiTheme="minorHAnsi" w:hAnsiTheme="minorHAnsi" w:hint="cs"/>
+          <w:rtl/>
+          <w:lang w:val="en-US"/>
+        </w:rPr>
+        <w:t xml:space="preserve"> בכל סוגי הסרטן שנבדקו</w:t>
+      </w:r>
+      <w:r>
+        <w:rPr>
+          <w:rFonts w:asciiTheme="minorHAnsi" w:hAnsiTheme="minorHAnsi" w:hint="cs"/>
+          <w:rtl/>
+          <w:lang w:val="en-US"/>
+        </w:rPr>
+        <w:t>, אבל ה-</w:t>
+      </w:r>
+      <w:r>
+        <w:rPr>
+          <w:rFonts w:asciiTheme="minorHAnsi" w:hAnsiTheme="minorHAnsi"/>
+          <w:lang w:val="en-US"/>
+        </w:rPr>
+        <w:t>magnitude</w:t>
+      </w:r>
+      <w:r>
+        <w:rPr>
+          <w:rFonts w:asciiTheme="minorHAnsi" w:hAnsiTheme="minorHAnsi" w:hint="cs"/>
+          <w:rtl/>
+          <w:lang w:val="en-US"/>
+        </w:rPr>
+        <w:t xml:space="preserve"> שונה משמעותית בין סרטן לסרטן.</w:t>
+      </w:r>
+      <w:r>
+        <w:rPr>
+          <w:rFonts w:asciiTheme="minorHAnsi" w:hAnsiTheme="minorHAnsi" w:hint="cs"/>
+          <w:rtl/>
+          <w:lang w:val="en-US"/>
+        </w:rPr>
+        <w:t xml:space="preserve"> בסרטן דם אנחנו רואים </w:t>
+      </w:r>
+      <w:r>
+        <w:rPr>
+          <w:rFonts w:asciiTheme="minorHAnsi" w:hAnsiTheme="minorHAnsi"/>
+          <w:lang w:val="en-US"/>
+        </w:rPr>
+        <w:t>~200x fold change</w:t>
+      </w:r>
+      <w:r>
+        <w:rPr>
+          <w:rFonts w:asciiTheme="minorHAnsi" w:hAnsiTheme="minorHAnsi" w:hint="cs"/>
+          <w:rtl/>
+          <w:lang w:val="en-US"/>
+        </w:rPr>
+        <w:t xml:space="preserve"> ובאחרים אנחנו רואים כמעט 0.</w:t>
+      </w:r>
+    </w:p>
+    <w:p>
+      <w:pPr>
+        <w:pStyle w:val="NormalWeb"/>
+        <w:bidi/>
+        <w:ind w:left="720"/>
+        <w:rPr>
+          <w:rFonts w:asciiTheme="minorHAnsi" w:hAnsiTheme="minorHAnsi"/>
+          <w:lang w:val="en-US"/>
+        </w:rPr>
+      </w:pPr>
+      <w:r>
+        <w:rPr>
+          <w:rFonts w:asciiTheme="minorHAnsi" w:hAnsiTheme="minorHAnsi"/>
+          <w:rtl/>
+          <w:lang w:val="en-US"/>
+        </w:rPr>
+        <w:lastRenderedPageBreak/>
+        <w:drawing>
+          <wp:inline distT="0" distB="0" distL="0" distR="0" wp14:anchorId="02E985B8" wp14:editId="27A223EC">
+            <wp:extent cx="5943600" cy="2595245"/>
+            <wp:effectExtent l="0" t="0" r="0" b="0"/>
+            <wp:docPr id="1777709255" name="Picture 1"/>
+            <wp:cNvGraphicFramePr>
+              <a:graphicFrameLocks xmlns:a="http://schemas.openxmlformats.org/drawingml/2006/main" noChangeAspect="1"/>
+            </wp:cNvGraphicFramePr>
+            <a:graphic xmlns:a="http://schemas.openxmlformats.org/drawingml/2006/main">
+              <a:graphicData uri="http://schemas.openxmlformats.org/drawingml/2006/picture">
+                <pic:pic xmlns:pic="http://schemas.openxmlformats.org/drawingml/2006/picture">
+                  <pic:nvPicPr>
+                    <pic:cNvPr id="1777709255" name=""/>
+                    <pic:cNvPicPr/>
+                  </pic:nvPicPr>
+                  <pic:blipFill>
+                    <a:blip r:embed="rId8"/>
+                    <a:stretch>
+                      <a:fillRect/>
+                    </a:stretch>
+                  </pic:blipFill>
+                  <pic:spPr>
+                    <a:xfrm>
+                      <a:off x="0" y="0"/>
+                      <a:ext cx="5943600" cy="2595245"/>
+                    </a:xfrm>
+                    <a:prstGeom prst="rect">
+                      <a:avLst/>
+                    </a:prstGeom>
+                  </pic:spPr>
+                </pic:pic>
+              </a:graphicData>
+            </a:graphic>
+          </wp:inline>
+        </w:drawing>
+      </w:r>
+    </w:p>
+    <w:p>
+      <w:pPr>
+        <w:pStyle w:val="NormalWeb"/>
+        <w:bidi/>
+        <w:ind w:left="720"/>
+        <w:rPr>
+          <w:rFonts w:asciiTheme="minorHAnsi" w:hAnsiTheme="minorHAnsi"/>
+          <w:lang w:val="en-US"/>
+        </w:rPr>
+      </w:pPr>
+      <w:r>
+        <w:rPr>
+          <w:rFonts w:asciiTheme="minorHAnsi" w:hAnsiTheme="minorHAnsi"/>
+          <w:rtl/>
+          <w:lang w:val="en-US"/>
+        </w:rPr>
+        <w:t xml:space="preserve">בקצרה: הפאנל השמאלי מציג את ההשפעה </w:t>
+      </w:r>
+      <w:r>
+        <w:rPr>
+          <w:rFonts w:asciiTheme="minorHAnsi" w:hAnsiTheme="minorHAnsi"/>
+          <w:b/>
+          <w:bCs/>
+          <w:rtl/>
+          <w:lang w:val="en-US"/>
+        </w:rPr>
+        <w:t>היחסית</w:t>
+      </w:r>
+      <w:r>
+        <w:rPr>
+          <w:rFonts w:asciiTheme="minorHAnsi" w:hAnsiTheme="minorHAnsi"/>
+          <w:rtl/>
+          <w:lang w:val="en-US"/>
+        </w:rPr>
+        <w:t xml:space="preserve"> </w:t>
+      </w:r>
+      <w:r>
+        <w:rPr>
+          <w:rFonts w:asciiTheme="minorHAnsi" w:hAnsiTheme="minorHAnsi"/>
+        </w:rPr>
+        <w:t>(fold change)</w:t>
+      </w:r>
+      <w:r>
+        <w:rPr>
+          <w:rFonts w:asciiTheme="minorHAnsi" w:hAnsiTheme="minorHAnsi" w:hint="cs"/>
+          <w:rtl/>
+        </w:rPr>
+        <w:t>,</w:t>
+      </w:r>
+      <w:r>
+        <w:rPr>
+          <w:rFonts w:asciiTheme="minorHAnsi" w:hAnsiTheme="minorHAnsi"/>
+        </w:rPr>
+        <w:t xml:space="preserve"> </w:t>
+      </w:r>
+      <w:r>
+        <w:rPr>
+          <w:rFonts w:asciiTheme="minorHAnsi" w:hAnsiTheme="minorHAnsi"/>
+          <w:rtl/>
+          <w:lang w:val="en-US"/>
+        </w:rPr>
+        <w:t xml:space="preserve">והפאנל הימני </w:t>
+      </w:r>
+      <w:r>
+        <w:rPr>
+          <w:rFonts w:asciiTheme="minorHAnsi" w:hAnsiTheme="minorHAnsi" w:hint="cs"/>
+          <w:rtl/>
+          <w:lang w:val="en-US"/>
+        </w:rPr>
+        <w:t>מראה</w:t>
+      </w:r>
+      <w:r>
+        <w:rPr>
+          <w:rFonts w:asciiTheme="minorHAnsi" w:hAnsiTheme="minorHAnsi"/>
+          <w:rtl/>
+          <w:lang w:val="en-US"/>
+        </w:rPr>
+        <w:t xml:space="preserve"> את ההקשר </w:t>
+      </w:r>
+      <w:r>
+        <w:rPr>
+          <w:rFonts w:asciiTheme="minorHAnsi" w:hAnsiTheme="minorHAnsi"/>
+          <w:b/>
+          <w:bCs/>
+          <w:rtl/>
+          <w:lang w:val="en-US"/>
+        </w:rPr>
+        <w:t>האבסולוטי</w:t>
+      </w:r>
+      <w:r>
+        <w:rPr>
+          <w:rFonts w:asciiTheme="minorHAnsi" w:hAnsiTheme="minorHAnsi"/>
+          <w:rtl/>
+          <w:lang w:val="en-US"/>
+        </w:rPr>
+        <w:t xml:space="preserve"> שמונע פרשנות שגויה</w:t>
+      </w:r>
+      <w:r>
+        <w:rPr>
+          <w:rFonts w:asciiTheme="minorHAnsi" w:hAnsiTheme="minorHAnsi" w:hint="cs"/>
+          <w:rtl/>
+          <w:lang w:val="en-US"/>
+        </w:rPr>
+        <w:t>:</w:t>
+      </w:r>
+      <w:r>
+        <w:rPr>
+          <w:rFonts w:asciiTheme="minorHAnsi" w:hAnsiTheme="minorHAnsi"/>
+        </w:rPr>
+        <w:t xml:space="preserve"> fold change </w:t>
+      </w:r>
+      <w:r>
+        <w:rPr>
+          <w:rFonts w:asciiTheme="minorHAnsi" w:hAnsiTheme="minorHAnsi"/>
+          <w:rtl/>
+          <w:lang w:val="en-US"/>
+        </w:rPr>
+        <w:t xml:space="preserve">של </w:t>
+      </w:r>
+      <w:r>
+        <w:rPr>
+          <w:rFonts w:asciiTheme="minorHAnsi" w:hAnsiTheme="minorHAnsi" w:hint="cs"/>
+          <w:rtl/>
+          <w:lang w:val="en-US"/>
+        </w:rPr>
+        <w:t xml:space="preserve">פי 200 </w:t>
+      </w:r>
+      <w:r>
+        <w:rPr>
+          <w:rFonts w:asciiTheme="minorHAnsi" w:hAnsiTheme="minorHAnsi"/>
+          <w:rtl/>
+          <w:lang w:val="en-US"/>
+        </w:rPr>
+        <w:t>בסרטני דם נשמע דרמטי, אבל בפועל מדובר במעבר מ-~0 ל-~0.03, בעוד שבסרטן שחל</w:t>
+      </w:r>
+      <w:r>
+        <w:rPr>
+          <w:rFonts w:asciiTheme="minorHAnsi" w:hAnsiTheme="minorHAnsi" w:hint="cs"/>
+          <w:rtl/>
+          <w:lang w:val="en-US"/>
+        </w:rPr>
+        <w:t>ה ה-</w:t>
+      </w:r>
+      <w:r>
+        <w:rPr>
+          <w:rFonts w:asciiTheme="minorHAnsi" w:hAnsiTheme="minorHAnsi"/>
+          <w:lang w:val="en-US"/>
+        </w:rPr>
+        <w:t>fold change</w:t>
+      </w:r>
+      <w:r>
+        <w:rPr>
+          <w:rFonts w:asciiTheme="minorHAnsi" w:hAnsiTheme="minorHAnsi" w:hint="cs"/>
+          <w:rtl/>
+          <w:lang w:val="en-US"/>
+        </w:rPr>
+        <w:t xml:space="preserve"> </w:t>
+      </w:r>
+      <w:r>
+        <w:rPr>
+          <w:rFonts w:asciiTheme="minorHAnsi" w:hAnsiTheme="minorHAnsi"/>
+        </w:rPr>
+        <w:t xml:space="preserve"> </w:t>
+      </w:r>
+      <w:r>
+        <w:rPr>
+          <w:rFonts w:asciiTheme="minorHAnsi" w:hAnsiTheme="minorHAnsi"/>
+          <w:rtl/>
+          <w:lang w:val="en-US"/>
+        </w:rPr>
+        <w:t>צנוע יחסית</w:t>
+      </w:r>
+      <w:r>
+        <w:rPr>
+          <w:rFonts w:asciiTheme="minorHAnsi" w:hAnsiTheme="minorHAnsi" w:hint="cs"/>
+          <w:rtl/>
+          <w:lang w:val="en-US"/>
+        </w:rPr>
+        <w:t>,</w:t>
+      </w:r>
+      <w:r>
+        <w:rPr>
+          <w:rFonts w:asciiTheme="minorHAnsi" w:hAnsiTheme="minorHAnsi"/>
+          <w:rtl/>
+          <w:lang w:val="en-US"/>
+        </w:rPr>
+        <w:t xml:space="preserve"> אך משקף מעבר מ-0.086 ל-0.394</w:t>
+      </w:r>
+      <w:r>
+        <w:rPr>
+          <w:rFonts w:asciiTheme="minorHAnsi" w:hAnsiTheme="minorHAnsi" w:hint="cs"/>
+          <w:rtl/>
+          <w:lang w:val="en-US"/>
+        </w:rPr>
+        <w:t>,</w:t>
+      </w:r>
+      <w:r>
+        <w:rPr>
+          <w:rFonts w:asciiTheme="minorHAnsi" w:hAnsiTheme="minorHAnsi"/>
+          <w:rtl/>
+          <w:lang w:val="en-US"/>
+        </w:rPr>
+        <w:t xml:space="preserve"> </w:t>
+      </w:r>
+      <w:r>
+        <w:rPr>
+          <w:rFonts w:asciiTheme="minorHAnsi" w:hAnsiTheme="minorHAnsi" w:hint="cs"/>
+          <w:rtl/>
+          <w:lang w:val="en-US"/>
+        </w:rPr>
+        <w:t>ז״א</w:t>
+      </w:r>
+      <w:r>
+        <w:rPr>
+          <w:rFonts w:asciiTheme="minorHAnsi" w:hAnsiTheme="minorHAnsi"/>
+          <w:rtl/>
+          <w:lang w:val="en-US"/>
+        </w:rPr>
+        <w:t xml:space="preserve"> כמעט 40% מהגנום מושפע</w:t>
+      </w:r>
+      <w:r>
+        <w:rPr>
+          <w:rFonts w:asciiTheme="minorHAnsi" w:hAnsiTheme="minorHAnsi"/>
+        </w:rPr>
+        <w:t>.</w:t>
+      </w:r>
+    </w:p>
+    <w:p>
+      <w:pPr>
+        <w:pStyle w:val="NormalWeb"/>
+        <w:bidi/>
+        <w:rPr>
+          <w:rFonts w:asciiTheme="minorHAnsi" w:hAnsiTheme="minorHAnsi"/>
+          <w:rtl/>
+          <w:lang w:val="en-US"/>
+        </w:rPr>
+      </w:pPr>
+      <w:r>
+        <w:rPr>
+          <w:rFonts w:asciiTheme="minorHAnsi" w:hAnsiTheme="minorHAnsi" w:hint="cs"/>
+          <w:rtl/>
+          <w:lang w:val="en-US"/>
+        </w:rPr>
+        <w:t>אנליזה משנית:</w:t>
+      </w:r>
+    </w:p>
+    <w:p>
+      <w:pPr>
+        <w:pStyle w:val="NormalWeb"/>
+        <w:bidi/>
+        <w:ind w:left="720"/>
+        <w:rPr>
+          <w:rFonts w:asciiTheme="minorHAnsi" w:hAnsiTheme="minorHAnsi"/>
+          <w:rtl/>
+          <w:lang w:val="en-US"/>
+        </w:rPr>
+      </w:pPr>
+      <w:r>
+        <w:rPr>
+          <w:rFonts w:asciiTheme="minorHAnsi" w:hAnsiTheme="minorHAnsi"/>
+          <w:rtl/>
+          <w:lang w:val="en-US"/>
+        </w:rPr>
+        <w:drawing>
+          <wp:inline distT="0" distB="0" distL="0" distR="0" wp14:anchorId="5AEB35B2" wp14:editId="2E85445D">
+            <wp:extent cx="5943600" cy="3065145"/>
+            <wp:effectExtent l="0" t="0" r="0" b="0"/>
+            <wp:docPr id="274228283" name="Picture 1"/>
+            <wp:cNvGraphicFramePr>
+              <a:graphicFrameLocks xmlns:a="http://schemas.openxmlformats.org/drawingml/2006/main" noChangeAspect="1"/>
+            </wp:cNvGraphicFramePr>
+            <a:graphic xmlns:a="http://schemas.openxmlformats.org/drawingml/2006/main">
+              <a:graphicData uri="http://schemas.openxmlformats.org/drawingml/2006/picture">
+                <pic:pic xmlns:pic="http://schemas.openxmlformats.org/drawingml/2006/picture">
+                  <pic:nvPicPr>
+                    <pic:cNvPr id="274228283" name=""/>
+                    <pic:cNvPicPr/>
+                  </pic:nvPicPr>
+                  <pic:blipFill>
+                    <a:blip r:embed="rId9"/>
+                    <a:stretch>
+                      <a:fillRect/>
+                    </a:stretch>
+                  </pic:blipFill>
+                  <pic:spPr>
+                    <a:xfrm>
+                      <a:off x="0" y="0"/>
+                      <a:ext cx="5943600" cy="3065145"/>
+                    </a:xfrm>
+                    <a:prstGeom prst="rect">
+                      <a:avLst/>
+                    </a:prstGeom>
+                  </pic:spPr>
+                </pic:pic>
+              </a:graphicData>
+            </a:graphic>
+          </wp:inline>
+        </w:drawing>
+      </w:r>
+    </w:p>
+    <w:p>
+      <w:pPr>
+        <w:pStyle w:val="NormalWeb"/>
+        <w:numPr>
+          <w:ilvl w:val="0"/>
+          <w:numId w:val="8"/>
+        </w:numPr>
+        <w:bidi/>
+        <w:rPr>
+          <w:rFonts w:asciiTheme="minorHAnsi" w:hAnsiTheme="minorHAnsi"/>
+          <w:lang w:val="en-US"/>
+        </w:rPr>
+      </w:pPr>
+      <w:r>
+        <w:rPr>
+          <w:rFonts w:asciiTheme="minorHAnsi" w:hAnsiTheme="minorHAnsi" w:hint="cs"/>
+          <w:rtl/>
+          <w:lang w:val="en-US"/>
+        </w:rPr>
+        <w:t xml:space="preserve">משמאל רואים גנים שמשמעותית </w:t>
+      </w:r>
+      <w:r>
+        <w:rPr>
+          <w:rFonts w:asciiTheme="minorHAnsi" w:hAnsiTheme="minorHAnsi"/>
+          <w:lang w:val="en-US"/>
+        </w:rPr>
+        <w:t>amplified</w:t>
+      </w:r>
+      <w:r>
+        <w:rPr>
+          <w:rFonts w:asciiTheme="minorHAnsi" w:hAnsiTheme="minorHAnsi" w:hint="cs"/>
+          <w:rtl/>
+          <w:lang w:val="en-US"/>
+        </w:rPr>
+        <w:t xml:space="preserve"> במוטציות </w:t>
+      </w:r>
+      <w:r>
+        <w:rPr>
+          <w:rFonts w:asciiTheme="minorHAnsi" w:hAnsiTheme="minorHAnsi"/>
+          <w:lang w:val="en-US"/>
+        </w:rPr>
+        <w:t>TP53</w:t>
+      </w:r>
+      <w:r>
+        <w:rPr>
+          <w:rFonts w:asciiTheme="minorHAnsi" w:hAnsiTheme="minorHAnsi" w:hint="cs"/>
+          <w:rtl/>
+          <w:lang w:val="en-US"/>
+        </w:rPr>
+        <w:t xml:space="preserve"> עם </w:t>
+      </w:r>
+      <w:r>
+        <w:rPr>
+          <w:rFonts w:asciiTheme="minorHAnsi" w:hAnsiTheme="minorHAnsi"/>
+          <w:lang w:val="en-US"/>
+        </w:rPr>
+        <w:t>FGA</w:t>
+      </w:r>
+      <w:r>
+        <w:rPr>
+          <w:rFonts w:asciiTheme="minorHAnsi" w:hAnsiTheme="minorHAnsi" w:hint="cs"/>
+          <w:rtl/>
+          <w:lang w:val="en-US"/>
+        </w:rPr>
+        <w:t xml:space="preserve"> גבוה בהשוואה לכאלה עם </w:t>
+      </w:r>
+      <w:r>
+        <w:rPr>
+          <w:rFonts w:asciiTheme="minorHAnsi" w:hAnsiTheme="minorHAnsi"/>
+          <w:lang w:val="en-US"/>
+        </w:rPr>
+        <w:t>FGA</w:t>
+      </w:r>
+      <w:r>
+        <w:rPr>
+          <w:rFonts w:asciiTheme="minorHAnsi" w:hAnsiTheme="minorHAnsi" w:hint="cs"/>
+          <w:rtl/>
+          <w:lang w:val="en-US"/>
+        </w:rPr>
+        <w:t xml:space="preserve"> נמוך. </w:t>
+      </w:r>
+      <w:r>
+        <w:rPr>
+          <w:rFonts w:asciiTheme="minorHAnsi" w:hAnsiTheme="minorHAnsi" w:hint="cs"/>
+          <w:rtl/>
+          <w:lang w:val="en-US"/>
+        </w:rPr>
+        <w:t xml:space="preserve">אפשר לראות שאונקוגן קלאסי שגורם להאצת התחלקות תאים, כמו </w:t>
+      </w:r>
+      <w:r>
+        <w:rPr>
+          <w:rFonts w:asciiTheme="minorHAnsi" w:hAnsiTheme="minorHAnsi"/>
+          <w:lang w:val="en-US"/>
+        </w:rPr>
+        <w:t>MYC</w:t>
+      </w:r>
+      <w:r>
+        <w:rPr>
+          <w:rFonts w:asciiTheme="minorHAnsi" w:hAnsiTheme="minorHAnsi" w:hint="cs"/>
+          <w:rtl/>
+          <w:lang w:val="en-US"/>
+        </w:rPr>
+        <w:t xml:space="preserve"> מאוד </w:t>
+      </w:r>
+      <w:r>
+        <w:rPr>
+          <w:rFonts w:asciiTheme="minorHAnsi" w:hAnsiTheme="minorHAnsi"/>
+          <w:lang w:val="en-US"/>
+        </w:rPr>
+        <w:t>differentially expressed</w:t>
+      </w:r>
+      <w:r>
+        <w:rPr>
+          <w:rFonts w:asciiTheme="minorHAnsi" w:hAnsiTheme="minorHAnsi" w:hint="cs"/>
+          <w:rtl/>
+          <w:lang w:val="en-US"/>
+        </w:rPr>
+        <w:t>.</w:t>
+      </w:r>
+      <w:r>
+        <w:rPr>
+          <w:rFonts w:asciiTheme="minorHAnsi" w:hAnsiTheme="minorHAnsi" w:hint="cs"/>
+          <w:rtl/>
+          <w:lang w:val="en-US"/>
+        </w:rPr>
+        <w:t xml:space="preserve"> יש גם את </w:t>
+      </w:r>
+      <w:r>
+        <w:rPr>
+          <w:rFonts w:asciiTheme="minorHAnsi" w:hAnsiTheme="minorHAnsi"/>
+          <w:lang w:val="en-US"/>
+        </w:rPr>
+        <w:t>CCNE1</w:t>
+      </w:r>
+      <w:r>
+        <w:rPr>
+          <w:rFonts w:asciiTheme="minorHAnsi" w:hAnsiTheme="minorHAnsi" w:hint="cs"/>
+          <w:rtl/>
+          <w:lang w:val="en-US"/>
+        </w:rPr>
+        <w:t xml:space="preserve"> ו-</w:t>
+      </w:r>
+      <w:r>
+        <w:rPr>
+          <w:rFonts w:asciiTheme="minorHAnsi" w:hAnsiTheme="minorHAnsi"/>
+          <w:lang w:val="en-US"/>
+        </w:rPr>
+        <w:t>CCND1</w:t>
+      </w:r>
+      <w:r>
+        <w:rPr>
+          <w:rFonts w:asciiTheme="minorHAnsi" w:hAnsiTheme="minorHAnsi" w:hint="cs"/>
+          <w:rtl/>
+          <w:lang w:val="en-US"/>
+        </w:rPr>
+        <w:t xml:space="preserve">, שניהם מאיצי </w:t>
+      </w:r>
+      <w:r>
+        <w:rPr>
+          <w:rFonts w:asciiTheme="minorHAnsi" w:hAnsiTheme="minorHAnsi"/>
+          <w:lang w:val="en-US"/>
+        </w:rPr>
+        <w:t>cell cycle</w:t>
+      </w:r>
+      <w:r>
+        <w:rPr>
+          <w:rFonts w:asciiTheme="minorHAnsi" w:hAnsiTheme="minorHAnsi" w:hint="cs"/>
+          <w:rtl/>
+          <w:lang w:val="en-US"/>
+        </w:rPr>
+        <w:t>, הצ׳קפוינטס בעצם מדולגים.</w:t>
+      </w:r>
+      <w:r>
+        <w:rPr>
+          <w:rFonts w:asciiTheme="minorHAnsi" w:hAnsiTheme="minorHAnsi" w:hint="cs"/>
+          <w:rtl/>
+          <w:lang w:val="en-US"/>
+        </w:rPr>
+        <w:t xml:space="preserve"> </w:t>
+      </w:r>
+      <w:r>
+        <w:rPr>
+          <w:rFonts w:asciiTheme="minorHAnsi" w:hAnsiTheme="minorHAnsi"/>
+          <w:lang w:val="en-US"/>
+        </w:rPr>
+        <w:t>FGF19</w:t>
+      </w:r>
+      <w:r>
+        <w:rPr>
+          <w:rFonts w:asciiTheme="minorHAnsi" w:hAnsiTheme="minorHAnsi" w:hint="cs"/>
+          <w:rtl/>
+          <w:lang w:val="en-US"/>
+        </w:rPr>
+        <w:t xml:space="preserve">, </w:t>
+      </w:r>
+      <w:r>
+        <w:rPr>
+          <w:rFonts w:asciiTheme="minorHAnsi" w:hAnsiTheme="minorHAnsi"/>
+          <w:lang w:val="en-US"/>
+        </w:rPr>
+        <w:t>FGF4/3</w:t>
+      </w:r>
+      <w:r>
+        <w:rPr>
+          <w:rFonts w:asciiTheme="minorHAnsi" w:hAnsiTheme="minorHAnsi" w:hint="cs"/>
+          <w:rtl/>
+          <w:lang w:val="en-US"/>
+        </w:rPr>
+        <w:t xml:space="preserve">, </w:t>
+      </w:r>
+      <w:r>
+        <w:rPr>
+          <w:rFonts w:asciiTheme="minorHAnsi" w:hAnsiTheme="minorHAnsi"/>
+          <w:lang w:val="en-US"/>
+        </w:rPr>
+        <w:t>FGFR1</w:t>
+      </w:r>
+      <w:r>
+        <w:rPr>
+          <w:rFonts w:asciiTheme="minorHAnsi" w:hAnsiTheme="minorHAnsi" w:hint="cs"/>
+          <w:rtl/>
+          <w:lang w:val="en-US"/>
+        </w:rPr>
+        <w:t xml:space="preserve"> הם פקטורי גדילה פיברובלסטים, מניעים סיגנלי פרוליפרציה ושרידות.</w:t>
+      </w:r>
+      <w:r>
+        <w:rPr>
+          <w:rFonts w:asciiTheme="minorHAnsi" w:hAnsiTheme="minorHAnsi" w:hint="cs"/>
+          <w:rtl/>
+          <w:lang w:val="en-US"/>
+        </w:rPr>
+        <w:t xml:space="preserve"> </w:t>
+      </w:r>
+      <w:r>
+        <w:rPr>
+          <w:rFonts w:asciiTheme="minorHAnsi" w:hAnsiTheme="minorHAnsi"/>
+          <w:lang w:val="en-US"/>
+        </w:rPr>
+        <w:t>ERBB2</w:t>
+      </w:r>
+      <w:r>
+        <w:rPr>
+          <w:rFonts w:asciiTheme="minorHAnsi" w:hAnsiTheme="minorHAnsi" w:hint="cs"/>
+          <w:rtl/>
+          <w:lang w:val="en-US"/>
+        </w:rPr>
+        <w:t xml:space="preserve"> הוא בעצם </w:t>
+      </w:r>
+      <w:r>
+        <w:rPr>
+          <w:rFonts w:asciiTheme="minorHAnsi" w:hAnsiTheme="minorHAnsi"/>
+          <w:lang w:val="en-US"/>
+        </w:rPr>
+        <w:t>HER2</w:t>
+      </w:r>
+      <w:r>
+        <w:rPr>
+          <w:rFonts w:asciiTheme="minorHAnsi" w:hAnsiTheme="minorHAnsi" w:hint="cs"/>
+          <w:rtl/>
+          <w:lang w:val="en-US"/>
+        </w:rPr>
+        <w:t xml:space="preserve">, עוד פקטור גדילה. הוא ידוע בתור טרגט </w:t>
+      </w:r>
+      <w:r>
+        <w:rPr>
+          <w:rFonts w:asciiTheme="minorHAnsi" w:hAnsiTheme="minorHAnsi" w:hint="cs"/>
+          <w:rtl/>
+          <w:lang w:val="en-US"/>
+        </w:rPr>
+        <w:lastRenderedPageBreak/>
+        <w:t>בסרטן השד</w:t>
+      </w:r>
+      <w:r>
+        <w:rPr>
+          <w:rFonts w:asciiTheme="minorHAnsi" w:hAnsiTheme="minorHAnsi" w:hint="cs"/>
+          <w:rtl/>
+          <w:lang w:val="en-US"/>
+        </w:rPr>
+        <w:t xml:space="preserve">. </w:t>
+      </w:r>
+      <w:r>
+        <w:rPr>
+          <w:rFonts w:asciiTheme="minorHAnsi" w:hAnsiTheme="minorHAnsi"/>
+          <w:lang w:val="en-US"/>
+        </w:rPr>
+        <w:t>MCL1</w:t>
+      </w:r>
+      <w:r>
+        <w:rPr>
+          <w:rFonts w:asciiTheme="minorHAnsi" w:hAnsiTheme="minorHAnsi" w:hint="cs"/>
+          <w:rtl/>
+          <w:lang w:val="en-US"/>
+        </w:rPr>
+        <w:t xml:space="preserve"> הוא גן אנטי אפופטוטי, עוזר לתאים להתחמק ממוות תאי. </w:t>
+      </w:r>
+      <w:r>
+        <w:rPr>
+          <w:rFonts w:asciiTheme="minorHAnsi" w:hAnsiTheme="minorHAnsi"/>
+          <w:lang w:val="en-US"/>
+        </w:rPr>
+        <w:t>TERT</w:t>
+      </w:r>
+      <w:r>
+        <w:rPr>
+          <w:rFonts w:asciiTheme="minorHAnsi" w:hAnsiTheme="minorHAnsi" w:hint="cs"/>
+          <w:rtl/>
+          <w:lang w:val="en-US"/>
+        </w:rPr>
+        <w:t xml:space="preserve"> הוא טלומראז, מאפשר רפליקציה לא מוגבלת.</w:t>
+      </w:r>
+      <w:r>
+        <w:rPr>
+          <w:rFonts w:asciiTheme="minorHAnsi" w:hAnsiTheme="minorHAnsi" w:hint="cs"/>
+          <w:rtl/>
+          <w:lang w:val="en-US"/>
+        </w:rPr>
+        <w:t xml:space="preserve"> </w:t>
+      </w:r>
+      <w:r>
+        <w:rPr>
+          <w:rFonts w:asciiTheme="minorHAnsi" w:hAnsiTheme="minorHAnsi"/>
+          <w:lang w:val="en-US"/>
+        </w:rPr>
+        <w:t>PIK3CA</w:t>
+      </w:r>
+      <w:r>
+        <w:rPr>
+          <w:rFonts w:asciiTheme="minorHAnsi" w:hAnsiTheme="minorHAnsi" w:hint="cs"/>
+          <w:rtl/>
+          <w:lang w:val="en-US"/>
+        </w:rPr>
+        <w:t xml:space="preserve"> הוא גן ל-</w:t>
+      </w:r>
+      <w:r>
+        <w:rPr>
+          <w:rFonts w:asciiTheme="minorHAnsi" w:hAnsiTheme="minorHAnsi"/>
+          <w:lang w:val="en-US"/>
+        </w:rPr>
+        <w:t>survival signaling</w:t>
+      </w:r>
+      <w:r>
+        <w:rPr>
+          <w:rFonts w:asciiTheme="minorHAnsi" w:hAnsiTheme="minorHAnsi" w:hint="cs"/>
+          <w:rtl/>
+          <w:lang w:val="en-US"/>
+        </w:rPr>
+        <w:t>.</w:t>
+      </w:r>
+    </w:p>
+    <w:p>
+      <w:pPr>
+        <w:pStyle w:val="NormalWeb"/>
+        <w:numPr>
+          <w:ilvl w:val="0"/>
+          <w:numId w:val="8"/>
+        </w:numPr>
+        <w:bidi/>
+        <w:rPr>
+          <w:rFonts w:asciiTheme="minorHAnsi" w:hAnsiTheme="minorHAnsi"/>
+          <w:lang w:val="en-US"/>
+        </w:rPr>
+      </w:pPr>
+      <w:r>
+        <w:rPr>
+          <w:rFonts w:asciiTheme="minorHAnsi" w:hAnsiTheme="minorHAnsi" w:hint="cs"/>
+          <w:rtl/>
+          <w:lang w:val="en-US"/>
+        </w:rPr>
+        <w:t xml:space="preserve">מימין רואים גנים שהם </w:t>
+      </w:r>
+      <w:r>
+        <w:rPr>
+          <w:rFonts w:asciiTheme="minorHAnsi" w:hAnsiTheme="minorHAnsi"/>
+          <w:lang w:val="en-US"/>
+        </w:rPr>
+        <w:t>tumor suppressors</w:t>
+      </w:r>
+      <w:r>
+        <w:rPr>
+          <w:rFonts w:asciiTheme="minorHAnsi" w:hAnsiTheme="minorHAnsi" w:hint="cs"/>
+          <w:rtl/>
+          <w:lang w:val="en-US"/>
+        </w:rPr>
+        <w:t>. אפשר לראות ש-</w:t>
+      </w:r>
+      <w:r>
+        <w:rPr>
+          <w:rFonts w:asciiTheme="minorHAnsi" w:hAnsiTheme="minorHAnsi"/>
+          <w:lang w:val="en-US"/>
+        </w:rPr>
+        <w:t>CDKN2A/B</w:t>
+      </w:r>
+      <w:r>
+        <w:rPr>
+          <w:rFonts w:asciiTheme="minorHAnsi" w:hAnsiTheme="minorHAnsi" w:hint="cs"/>
+          <w:rtl/>
+          <w:lang w:val="en-US"/>
+        </w:rPr>
+        <w:t xml:space="preserve"> למשך, ששניהם משחקים תפקיד מאוד חשוב ב-</w:t>
+      </w:r>
+      <w:r>
+        <w:rPr>
+          <w:rFonts w:asciiTheme="minorHAnsi" w:hAnsiTheme="minorHAnsi"/>
+          <w:lang w:val="en-US"/>
+        </w:rPr>
+        <w:t>growth control</w:t>
+      </w:r>
+      <w:r>
+        <w:rPr>
+          <w:rFonts w:asciiTheme="minorHAnsi" w:hAnsiTheme="minorHAnsi" w:hint="cs"/>
+          <w:rtl/>
+          <w:lang w:val="en-US"/>
+        </w:rPr>
+        <w:t>. כש-</w:t>
+      </w:r>
+      <w:r>
+        <w:rPr>
+          <w:rFonts w:asciiTheme="minorHAnsi" w:hAnsiTheme="minorHAnsi"/>
+          <w:lang w:val="en-US"/>
+        </w:rPr>
+        <w:t>TP53</w:t>
+      </w:r>
+      <w:r>
+        <w:rPr>
+          <w:rFonts w:asciiTheme="minorHAnsi" w:hAnsiTheme="minorHAnsi" w:hint="cs"/>
+          <w:rtl/>
+          <w:lang w:val="en-US"/>
+        </w:rPr>
+        <w:t xml:space="preserve"> איננו/לא תקין ושני אלה נמחקים, אין יותר בקרת גדילה.</w:t>
+      </w:r>
+      <w:r>
+        <w:rPr>
+          <w:rFonts w:asciiTheme="minorHAnsi" w:hAnsiTheme="minorHAnsi" w:hint="cs"/>
+          <w:rtl/>
+          <w:lang w:val="en-US"/>
+        </w:rPr>
+        <w:t xml:space="preserve"> </w:t>
+      </w:r>
+      <w:r>
+        <w:rPr>
+          <w:rFonts w:asciiTheme="minorHAnsi" w:hAnsiTheme="minorHAnsi"/>
+          <w:lang w:val="en-US"/>
+        </w:rPr>
+        <w:t>PTEN</w:t>
+      </w:r>
+      <w:r>
+        <w:rPr>
+          <w:rFonts w:asciiTheme="minorHAnsi" w:hAnsiTheme="minorHAnsi" w:hint="cs"/>
+          <w:rtl/>
+          <w:lang w:val="en-US"/>
+        </w:rPr>
+        <w:t xml:space="preserve"> הוא </w:t>
+      </w:r>
+      <w:r>
+        <w:rPr>
+          <w:rFonts w:asciiTheme="minorHAnsi" w:hAnsiTheme="minorHAnsi"/>
+          <w:lang w:val="en-US"/>
+        </w:rPr>
+        <w:t>PI3K pathway inhibitor</w:t>
+      </w:r>
+      <w:r>
+        <w:rPr>
+          <w:rFonts w:asciiTheme="minorHAnsi" w:hAnsiTheme="minorHAnsi" w:hint="cs"/>
+          <w:rtl/>
+          <w:lang w:val="en-US"/>
+        </w:rPr>
+        <w:t>. אבדן שלו גורם להפעלה של תהליכי הישרדות תאי.</w:t>
+      </w:r>
+      <w:r>
+        <w:rPr>
+          <w:rFonts w:asciiTheme="minorHAnsi" w:hAnsiTheme="minorHAnsi" w:hint="cs"/>
+          <w:rtl/>
+          <w:lang w:val="en-US"/>
+        </w:rPr>
+        <w:t xml:space="preserve"> </w:t>
+      </w:r>
+      <w:r>
+        <w:rPr>
+          <w:rFonts w:asciiTheme="minorHAnsi" w:hAnsiTheme="minorHAnsi"/>
+          <w:lang w:val="en-US"/>
+        </w:rPr>
+        <w:t>RB1</w:t>
+      </w:r>
+      <w:r>
+        <w:rPr>
+          <w:rFonts w:asciiTheme="minorHAnsi" w:hAnsiTheme="minorHAnsi" w:hint="cs"/>
+          <w:rtl/>
+          <w:lang w:val="en-US"/>
+        </w:rPr>
+        <w:t xml:space="preserve"> הוא טומר סופרסור ששולט ב-</w:t>
+      </w:r>
+      <w:r>
+        <w:rPr>
+          <w:rFonts w:asciiTheme="minorHAnsi" w:hAnsiTheme="minorHAnsi"/>
+          <w:lang w:val="en-US"/>
+        </w:rPr>
+        <w:t>cell cycle</w:t>
+      </w:r>
+      <w:r>
+        <w:rPr>
+          <w:rFonts w:asciiTheme="minorHAnsi" w:hAnsiTheme="minorHAnsi" w:hint="cs"/>
+          <w:rtl/>
+          <w:lang w:val="en-US"/>
+        </w:rPr>
+        <w:t xml:space="preserve">. </w:t>
+      </w:r>
+      <w:r>
+        <w:rPr>
+          <w:rFonts w:asciiTheme="minorHAnsi" w:hAnsiTheme="minorHAnsi"/>
+          <w:lang w:val="en-US"/>
+        </w:rPr>
+        <w:t>SMAD4</w:t>
+      </w:r>
+      <w:r>
+        <w:rPr>
+          <w:rFonts w:asciiTheme="minorHAnsi" w:hAnsiTheme="minorHAnsi" w:hint="cs"/>
+          <w:rtl/>
+          <w:lang w:val="en-US"/>
+        </w:rPr>
+        <w:t xml:space="preserve"> הוא </w:t>
+      </w:r>
+      <w:r>
+        <w:rPr>
+          <w:rFonts w:asciiTheme="minorHAnsi" w:hAnsiTheme="minorHAnsi"/>
+          <w:lang w:val="en-US"/>
+        </w:rPr>
+        <w:t>growth inhibition</w:t>
+      </w:r>
+      <w:r>
+        <w:rPr>
+          <w:rFonts w:asciiTheme="minorHAnsi" w:hAnsiTheme="minorHAnsi" w:hint="cs"/>
+          <w:rtl/>
+          <w:lang w:val="en-US"/>
+        </w:rPr>
+        <w:t xml:space="preserve">, </w:t>
+      </w:r>
+      <w:r>
+        <w:rPr>
+          <w:rFonts w:asciiTheme="minorHAnsi" w:hAnsiTheme="minorHAnsi"/>
+          <w:lang w:val="en-US"/>
+        </w:rPr>
+        <w:t>STK11</w:t>
+      </w:r>
+      <w:r>
+        <w:rPr>
+          <w:rFonts w:asciiTheme="minorHAnsi" w:hAnsiTheme="minorHAnsi" w:hint="cs"/>
+          <w:rtl/>
+          <w:lang w:val="en-US"/>
+        </w:rPr>
+        <w:t xml:space="preserve"> הוא טומר סופרסור מטאבולי ו-</w:t>
+      </w:r>
+      <w:r>
+        <w:rPr>
+          <w:rFonts w:asciiTheme="minorHAnsi" w:hAnsiTheme="minorHAnsi"/>
+          <w:lang w:val="en-US"/>
+        </w:rPr>
+        <w:t>NF1</w:t>
+      </w:r>
+      <w:r>
+        <w:rPr>
+          <w:rFonts w:asciiTheme="minorHAnsi" w:hAnsiTheme="minorHAnsi" w:hint="cs"/>
+          <w:rtl/>
+          <w:lang w:val="en-US"/>
+        </w:rPr>
+        <w:t xml:space="preserve"> הוא </w:t>
+      </w:r>
+      <w:r>
+        <w:rPr>
+          <w:rFonts w:asciiTheme="minorHAnsi" w:hAnsiTheme="minorHAnsi"/>
+          <w:lang w:val="en-US"/>
+        </w:rPr>
+        <w:t>RAS pathway inhibitor</w:t>
+      </w:r>
+      <w:r>
+        <w:rPr>
+          <w:rFonts w:asciiTheme="minorHAnsi" w:hAnsiTheme="minorHAnsi" w:hint="cs"/>
+          <w:rtl/>
+          <w:lang w:val="en-US"/>
+        </w:rPr>
+        <w:t>.</w:t>
+      </w:r>
+    </w:p>
+    <w:p>
+      <w:pPr>
+        <w:pStyle w:val="NormalWeb"/>
+        <w:bidi/>
+        <w:ind w:left="720"/>
+        <w:rPr>
+          <w:rFonts w:asciiTheme="minorHAnsi" w:hAnsiTheme="minorHAnsi" w:hint="cs"/>
+          <w:rtl/>
+          <w:lang w:val="en-US"/>
+        </w:rPr>
+      </w:pPr>
+      <w:r>
+        <w:rPr>
+          <w:rFonts w:asciiTheme="minorHAnsi" w:hAnsiTheme="minorHAnsi" w:hint="cs"/>
+          <w:rtl/>
+          <w:lang w:val="en-US"/>
+        </w:rPr>
+        <w:t>בעצם אנחנו רואים כאן את ההשלכות של בעיות ב-</w:t>
+      </w:r>
+      <w:r>
+        <w:rPr>
+          <w:rFonts w:asciiTheme="minorHAnsi" w:hAnsiTheme="minorHAnsi"/>
+          <w:lang w:val="en-US"/>
+        </w:rPr>
+        <w:t>TP53</w:t>
+      </w:r>
+      <w:r>
+        <w:rPr>
+          <w:rFonts w:asciiTheme="minorHAnsi" w:hAnsiTheme="minorHAnsi" w:hint="cs"/>
+          <w:rtl/>
+          <w:lang w:val="en-US"/>
+        </w:rPr>
+        <w:t xml:space="preserve">, הגנום הופך להיות לא יציב כמו שהראיתי באנליזה הראשונית. אנחנו רואים בפיגר למעלה מה קורה בעקבות זה, האונקוגנים </w:t>
+      </w:r>
+      <w:r>
+        <w:rPr>
+          <w:rFonts w:asciiTheme="minorHAnsi" w:hAnsiTheme="minorHAnsi"/>
+          <w:lang w:val="en-US"/>
+        </w:rPr>
+        <w:t>amplified</w:t>
+      </w:r>
+      <w:r>
+        <w:rPr>
+          <w:rFonts w:asciiTheme="minorHAnsi" w:hAnsiTheme="minorHAnsi" w:hint="cs"/>
+          <w:rtl/>
+          <w:lang w:val="en-US"/>
+        </w:rPr>
+        <w:t xml:space="preserve"> וה-</w:t>
+      </w:r>
+      <w:r>
+        <w:rPr>
+          <w:rFonts w:asciiTheme="minorHAnsi" w:hAnsiTheme="minorHAnsi"/>
+          <w:lang w:val="en-US"/>
+        </w:rPr>
+        <w:t>tumor suppressors</w:t>
+      </w:r>
+      <w:r>
+        <w:rPr>
+          <w:rFonts w:asciiTheme="minorHAnsi" w:hAnsiTheme="minorHAnsi" w:hint="cs"/>
+          <w:rtl/>
+          <w:lang w:val="en-US"/>
+        </w:rPr>
+        <w:t xml:space="preserve"> נמחקים (</w:t>
+      </w:r>
+      <w:r>
+        <w:rPr>
+          <w:rFonts w:asciiTheme="minorHAnsi" w:hAnsiTheme="minorHAnsi"/>
+          <w:lang w:val="en-US"/>
+        </w:rPr>
+        <w:t>no brakes</w:t>
+      </w:r>
+      <w:r>
+        <w:rPr>
+          <w:rFonts w:asciiTheme="minorHAnsi" w:hAnsiTheme="minorHAnsi" w:hint="cs"/>
+          <w:rtl/>
+          <w:lang w:val="en-US"/>
+        </w:rPr>
+        <w:t>).</w:t>
+      </w:r>
     </w:p>
     <w:sectPr>
       <w:pgSz w:w="12240" w:h="15840"/>
@@ -1711,6 +2813,95 @@
 <file path=word/numbering.xml><?xml version="1.0" encoding="utf-8"?>
 <w:numbering xmlns:wpc="http://schemas.microsoft.com/office/word/2010/wordprocessingCanvas" xmlns:cx="http://schemas.microsoft.com/office/drawing/2014/chartex" xmlns:cx1="http://schemas.microsoft.com/office/drawing/2015/9/8/chartex" xmlns:cx2="http://schemas.microsoft.com/office/drawing/2015/10/21/chartex" xmlns:cx3="http://schemas.microsoft.com/office/drawing/2016/5/9/chartex" xmlns:cx4="http://schemas.microsoft.com/office/drawing/2016/5/10/chartex" xmlns:cx5="http://schemas.microsoft.com/office/drawing/2016/5/11/chartex" xmlns:cx6="http://schemas.microsoft.com/office/drawing/2016/5/12/chartex" xmlns:cx7="http://schemas.microsoft.com/office/drawing/2016/5/13/chartex" xmlns:cx8="http://schemas.microsoft.com/office/drawing/2016/5/14/chartex" xmlns:mc="http://schemas.openxmlformats.org/markup-compatibility/2006" xmlns:aink="http://schemas.microsoft.com/office/drawing/2016/ink" xmlns:am3d="http://schemas.microsoft.com/office/drawing/2017/model3d" xmlns:o="urn:schemas-microsoft-com:office:office" xmlns:oel="http://schemas.microsoft.com/office/2019/extlst" xmlns:r="http://schemas.openxmlformats.org/officeDocument/2006/relationships" xmlns:m="http://schemas.openxmlformats.org/officeDocument/2006/math" xmlns:v="urn:schemas-microsoft-com:vml" xmlns:wp14="http://schemas.microsoft.com/office/word/2010/wordprocessingDrawing" xmlns:wp="http://schemas.openxmlformats.org/drawingml/2006/wordprocessingDrawing" xmlns:w10="urn:schemas-microsoft-com:office:word" xmlns:w="http://schemas.openxmlformats.org/wordprocessingml/2006/main" xmlns:w14="http://schemas.microsoft.com/office/word/2010/wordml" xmlns:w15="http://schemas.microsoft.com/office/word/2012/wordml" xmlns:w16cex="http://schemas.microsoft.com/office/word/2018/wordml/cex" xmlns:w16cid="http://schemas.microsoft.com/office/word/2016/wordml/cid" xmlns:w16="http://schemas.microsoft.com/office/word/2018/wordml" xmlns:w16du="http://schemas.microsoft.com/office/word/2023/wordml/word16du" xmlns:w16sdtdh="http://schemas.microsoft.com/office/word/2020/wordml/sdtdatahash" xmlns:w16sdtfl="http://schemas.microsoft.com/office/word/2024/wordml/sdtformatlock" xmlns:w16se="http://schemas.microsoft.com/office/word/2015/wordml/symex" xmlns:wpg="http://schemas.microsoft.com/office/word/2010/wordprocessingGroup" xmlns:wpi="http://schemas.microsoft.com/office/word/2010/wordprocessingInk" xmlns:wne="http://schemas.microsoft.com/office/word/2006/wordml" xmlns:wps="http://schemas.microsoft.com/office/word/2010/wordprocessingShape" mc:Ignorable="w14 w15 w16se w16cid w16 w16cex w16sdtdh w16sdtfl w16du wp14">
   <w:abstractNum w:abstractNumId="0" w15:restartNumberingAfterBreak="0">
+    <w:nsid w:val="0E255097"/>
+    <w:multiLevelType w:val="hybridMultilevel"/>
+    <w:tmpl w:val="0A40BC62"/>
+    <w:lvl w:ilvl="0" w:tplc="E3D4D5A8">
+      <w:start w:val="1"/>
+      <w:numFmt w:val="decimal"/>
+      <w:lvlText w:val="%1."/>
+      <w:lvlJc w:val="left"/>
+      <w:pPr>
+        <w:ind w:left="1080" w:hanging="360"/>
+      </w:pPr>
+      <w:rPr>
+        <w:rFonts w:hint="default"/>
+      </w:rPr>
+    </w:lvl>
+    <w:lvl w:ilvl="1" w:tplc="04090019" w:tentative="1">
+      <w:start w:val="1"/>
+      <w:numFmt w:val="lowerLetter"/>
+      <w:lvlText w:val="%2."/>
+      <w:lvlJc w:val="left"/>
+      <w:pPr>
+        <w:ind w:left="1800" w:hanging="360"/>
+      </w:pPr>
+    </w:lvl>
+    <w:lvl w:ilvl="2" w:tplc="0409001B" w:tentative="1">
+      <w:start w:val="1"/>
+      <w:numFmt w:val="lowerRoman"/>
+      <w:lvlText w:val="%3."/>
+      <w:lvlJc w:val="right"/>
+      <w:pPr>
+        <w:ind w:left="2520" w:hanging="180"/>
+      </w:pPr>
+    </w:lvl>
+    <w:lvl w:ilvl="3" w:tplc="0409000F" w:tentative="1">
+      <w:start w:val="1"/>
+      <w:numFmt w:val="decimal"/>
+      <w:lvlText w:val="%4."/>
+      <w:lvlJc w:val="left"/>
+      <w:pPr>
+        <w:ind w:left="3240" w:hanging="360"/>
+      </w:pPr>
+    </w:lvl>
+    <w:lvl w:ilvl="4" w:tplc="04090019" w:tentative="1">
+      <w:start w:val="1"/>
+      <w:numFmt w:val="lowerLetter"/>
+      <w:lvlText w:val="%5."/>
+      <w:lvlJc w:val="left"/>
+      <w:pPr>
+        <w:ind w:left="3960" w:hanging="360"/>
+      </w:pPr>
+    </w:lvl>
+    <w:lvl w:ilvl="5" w:tplc="0409001B" w:tentative="1">
+      <w:start w:val="1"/>
+      <w:numFmt w:val="lowerRoman"/>
+      <w:lvlText w:val="%6."/>
+      <w:lvlJc w:val="right"/>
+      <w:pPr>
+        <w:ind w:left="4680" w:hanging="180"/>
+      </w:pPr>
+    </w:lvl>
+    <w:lvl w:ilvl="6" w:tplc="0409000F" w:tentative="1">
+      <w:start w:val="1"/>
+      <w:numFmt w:val="decimal"/>
+      <w:lvlText w:val="%7."/>
+      <w:lvlJc w:val="left"/>
+      <w:pPr>
+        <w:ind w:left="5400" w:hanging="360"/>
+      </w:pPr>
+    </w:lvl>
+    <w:lvl w:ilvl="7" w:tplc="04090019" w:tentative="1">
+      <w:start w:val="1"/>
+      <w:numFmt w:val="lowerLetter"/>
+      <w:lvlText w:val="%8."/>
+      <w:lvlJc w:val="left"/>
+      <w:pPr>
+        <w:ind w:left="6120" w:hanging="360"/>
+      </w:pPr>
+    </w:lvl>
+    <w:lvl w:ilvl="8" w:tplc="0409001B" w:tentative="1">
+      <w:start w:val="1"/>
+      <w:numFmt w:val="lowerRoman"/>
+      <w:lvlText w:val="%9."/>
+      <w:lvlJc w:val="right"/>
+      <w:pPr>
+        <w:ind w:left="6840" w:hanging="180"/>
+      </w:pPr>
+    </w:lvl>
+  </w:abstractNum>
+  <w:abstractNum w:abstractNumId="1" w15:restartNumberingAfterBreak="0">
     <w:nsid w:val="0F027C2B"/>
     <w:multiLevelType w:val="hybridMultilevel"/>
     <w:tmpl w:val="19647F4A"/>
@@ -1799,7 +2990,7 @@
       </w:pPr>
     </w:lvl>
   </w:abstractNum>
-  <w:abstractNum w:abstractNumId="1" w15:restartNumberingAfterBreak="0">
+  <w:abstractNum w:abstractNumId="2" w15:restartNumberingAfterBreak="0">
     <w:nsid w:val="111D41A1"/>
     <w:multiLevelType w:val="hybridMultilevel"/>
     <w:tmpl w:val="77380E78"/>
@@ -1888,7 +3079,7 @@
       </w:pPr>
     </w:lvl>
   </w:abstractNum>
-  <w:abstractNum w:abstractNumId="2" w15:restartNumberingAfterBreak="0">
+  <w:abstractNum w:abstractNumId="3" w15:restartNumberingAfterBreak="0">
     <w:nsid w:val="32DB3C2B"/>
     <w:multiLevelType w:val="hybridMultilevel"/>
     <w:tmpl w:val="65CCA3DC"/>
@@ -1977,7 +3168,7 @@
       </w:pPr>
     </w:lvl>
   </w:abstractNum>
-  <w:abstractNum w:abstractNumId="3" w15:restartNumberingAfterBreak="0">
+  <w:abstractNum w:abstractNumId="4" w15:restartNumberingAfterBreak="0">
     <w:nsid w:val="3ABE5AF7"/>
     <w:multiLevelType w:val="hybridMultilevel"/>
     <w:tmpl w:val="EB0CC53E"/>
@@ -2066,7 +3257,7 @@
       </w:pPr>
     </w:lvl>
   </w:abstractNum>
-  <w:abstractNum w:abstractNumId="4" w15:restartNumberingAfterBreak="0">
+  <w:abstractNum w:abstractNumId="5" w15:restartNumberingAfterBreak="0">
     <w:nsid w:val="44CD367A"/>
     <w:multiLevelType w:val="hybridMultilevel"/>
     <w:tmpl w:val="B3C2C008"/>
@@ -2155,7 +3346,7 @@
       </w:pPr>
     </w:lvl>
   </w:abstractNum>
-  <w:abstractNum w:abstractNumId="5" w15:restartNumberingAfterBreak="0">
+  <w:abstractNum w:abstractNumId="6" w15:restartNumberingAfterBreak="0">
     <w:nsid w:val="55D47951"/>
     <w:multiLevelType w:val="hybridMultilevel"/>
     <w:tmpl w:val="7D9068DC"/>
@@ -2268,7 +3459,7 @@
       </w:rPr>
     </w:lvl>
   </w:abstractNum>
-  <w:abstractNum w:abstractNumId="6" w15:restartNumberingAfterBreak="0">
+  <w:abstractNum w:abstractNumId="7" w15:restartNumberingAfterBreak="0">
     <w:nsid w:val="6DC159A7"/>
     <w:multiLevelType w:val="hybridMultilevel"/>
     <w:tmpl w:val="ADD453DA"/>
@@ -2382,24 +3573,27 @@
     </w:lvl>
   </w:abstractNum>
   <w:num w:numId="1" w16cid:durableId="1328948006">
+    <w:abstractNumId w:val="3"/>
+  </w:num>
+  <w:num w:numId="2" w16cid:durableId="1506558411">
+    <w:abstractNumId w:val="5"/>
+  </w:num>
+  <w:num w:numId="3" w16cid:durableId="483475192">
+    <w:abstractNumId w:val="4"/>
+  </w:num>
+  <w:num w:numId="4" w16cid:durableId="1743982877">
     <w:abstractNumId w:val="2"/>
   </w:num>
-  <w:num w:numId="2" w16cid:durableId="1506558411">
-    <w:abstractNumId w:val="4"/>
+  <w:num w:numId="5" w16cid:durableId="307638122">
+    <w:abstractNumId w:val="7"/>
   </w:num>
-  <w:num w:numId="3" w16cid:durableId="483475192">
-    <w:abstractNumId w:val="3"/>
+  <w:num w:numId="6" w16cid:durableId="1430932710">
+    <w:abstractNumId w:val="6"/>
   </w:num>
-  <w:num w:numId="4" w16cid:durableId="1743982877">
+  <w:num w:numId="7" w16cid:durableId="515467020">
     <w:abstractNumId w:val="1"/>
   </w:num>
-  <w:num w:numId="5" w16cid:durableId="307638122">
-    <w:abstractNumId w:val="6"/>
-  </w:num>
-  <w:num w:numId="6" w16cid:durableId="1430932710">
-    <w:abstractNumId w:val="5"/>
-  </w:num>
-  <w:num w:numId="7" w16cid:durableId="515467020">
+  <w:num w:numId="8" w16cid:durableId="1919560966">
     <w:abstractNumId w:val="0"/>
   </w:num>
 </w:numbering>

</xml_diff>